<commit_message>
fix: resolve OOM crash with model registry, fix fusion text formatting, and clean up redundant files
</commit_message>
<xml_diff>
--- a/Notes/Fusion Engine Design.docx
+++ b/Notes/Fusion Engine Design.docx
@@ -14,6 +14,19 @@
           <w:u w:val="single"/>
         </w:rPr>
       </w:pPr>
+    </w:p>
+    <w:p>
+      <w:pPr>
+        <w:jc w:val="center"/>
+        <w:rPr>
+          <w:rFonts w:ascii="Microsoft Sans Serif" w:hAnsi="Microsoft Sans Serif" w:cs="Microsoft Sans Serif"/>
+          <w:b/>
+          <w:bCs/>
+          <w:sz w:val="48"/>
+          <w:szCs w:val="48"/>
+          <w:u w:val="single"/>
+        </w:rPr>
+      </w:pPr>
       <w:r>
         <w:rPr>
           <w:rFonts w:ascii="Microsoft Sans Serif" w:hAnsi="Microsoft Sans Serif" w:cs="Microsoft Sans Serif"/>
@@ -374,7 +387,6 @@
           <w:sz w:val="36"/>
           <w:szCs w:val="36"/>
         </w:rPr>
-        <w:lastRenderedPageBreak/>
         <w:t>3. Version 2: Semantic Clustering</w:t>
       </w:r>
     </w:p>
@@ -2081,6 +2093,7 @@
   <w:style w:type="character" w:default="1" w:styleId="DefaultParagraphFont">
     <w:name w:val="Default Paragraph Font"/>
     <w:uiPriority w:val="1"/>
+    <w:semiHidden/>
     <w:unhideWhenUsed/>
   </w:style>
   <w:style w:type="table" w:default="1" w:styleId="TableNormal">

</xml_diff>